<commit_message>
Without Calasparra in main branch
</commit_message>
<xml_diff>
--- a/Tab/Tab.1.docx
+++ b/Tab/Tab.1.docx
@@ -10,7 +10,7 @@
       </w:tblPr>
       <w:tblGrid>
         <w:gridCol w:w="1367"/>
-        <w:gridCol w:w="1414"/>
+        <w:gridCol w:w="1439"/>
         <w:gridCol w:w="1311"/>
         <w:gridCol w:w="1431"/>
         <w:gridCol w:w="1439"/>
@@ -116,49 +116,58 @@
               <w:jc w:val="right"/>
             </w:pPr>
             <w:r>
-              <w:t>-0.0000211</w:t>
-            </w:r>
-          </w:p>
-        </w:tc>
-        <w:tc>
-          <w:tcPr>
-            <w:tcW w:w="0" w:type="auto"/>
-          </w:tcPr>
-          <w:p>
-            <w:pPr>
-              <w:pStyle w:val="Compact"/>
-              <w:jc w:val="right"/>
-            </w:pPr>
-            <w:r>
-              <w:t>0.0002896</w:t>
-            </w:r>
-          </w:p>
-        </w:tc>
-        <w:tc>
-          <w:tcPr>
-            <w:tcW w:w="0" w:type="auto"/>
-          </w:tcPr>
-          <w:p>
-            <w:pPr>
-              <w:pStyle w:val="Compact"/>
-              <w:jc w:val="right"/>
-            </w:pPr>
-            <w:r>
-              <w:t>-0.000477</w:t>
-            </w:r>
-          </w:p>
-        </w:tc>
-        <w:tc>
-          <w:tcPr>
-            <w:tcW w:w="0" w:type="auto"/>
-          </w:tcPr>
-          <w:p>
-            <w:pPr>
-              <w:pStyle w:val="Compact"/>
-              <w:jc w:val="right"/>
-            </w:pPr>
-            <w:r>
-              <w:t>0.000650</w:t>
+              <w:t>-0.0000558</w:t>
+            </w:r>
+          </w:p>
+        </w:tc>
+        <w:tc>
+          <w:tcPr>
+            <w:tcW w:w="0" w:type="auto"/>
+          </w:tcPr>
+          <w:p>
+            <w:pPr>
+              <w:pStyle w:val="Compact"/>
+              <w:jc w:val="right"/>
+            </w:pPr>
+            <w:r>
+              <w:t>0.0002</w:t>
+            </w:r>
+            <w:r>
+              <w:t>36</w:t>
+            </w:r>
+          </w:p>
+        </w:tc>
+        <w:tc>
+          <w:tcPr>
+            <w:tcW w:w="0" w:type="auto"/>
+          </w:tcPr>
+          <w:p>
+            <w:pPr>
+              <w:pStyle w:val="Compact"/>
+              <w:jc w:val="right"/>
+            </w:pPr>
+            <w:r>
+              <w:t>-0.000</w:t>
+            </w:r>
+            <w:r>
+              <w:t>453</w:t>
+            </w:r>
+          </w:p>
+        </w:tc>
+        <w:tc>
+          <w:tcPr>
+            <w:tcW w:w="0" w:type="auto"/>
+          </w:tcPr>
+          <w:p>
+            <w:pPr>
+              <w:pStyle w:val="Compact"/>
+              <w:jc w:val="right"/>
+            </w:pPr>
+            <w:r>
+              <w:t>0.000</w:t>
+            </w:r>
+            <w:r>
+              <w:t>378</w:t>
             </w:r>
           </w:p>
         </w:tc>
@@ -174,7 +183,7 @@
             </w:pPr>
             <w:proofErr w:type="spellStart"/>
             <w:r>
-              <w:t>Calasparra</w:t>
+              <w:t>Drežnica</w:t>
             </w:r>
             <w:proofErr w:type="spellEnd"/>
           </w:p>
@@ -189,24 +198,24 @@
               <w:jc w:val="right"/>
             </w:pPr>
             <w:r>
-              <w:t>-0.00020</w:t>
-            </w:r>
-            <w:r>
-              <w:t>3</w:t>
-            </w:r>
-          </w:p>
-        </w:tc>
-        <w:tc>
-          <w:tcPr>
-            <w:tcW w:w="0" w:type="auto"/>
-          </w:tcPr>
-          <w:p>
-            <w:pPr>
-              <w:pStyle w:val="Compact"/>
-              <w:jc w:val="right"/>
-            </w:pPr>
-            <w:r>
-              <w:t>1.33</w:t>
+              <w:t>-0.000</w:t>
+            </w:r>
+            <w:r>
+              <w:t>290</w:t>
+            </w:r>
+          </w:p>
+        </w:tc>
+        <w:tc>
+          <w:tcPr>
+            <w:tcW w:w="0" w:type="auto"/>
+          </w:tcPr>
+          <w:p>
+            <w:pPr>
+              <w:pStyle w:val="Compact"/>
+              <w:jc w:val="right"/>
+            </w:pPr>
+            <w:r>
+              <w:t>2.60</w:t>
             </w:r>
             <w:r>
               <w:t>x10</w:t>
@@ -215,41 +224,44 @@
               <w:rPr>
                 <w:vertAlign w:val="superscript"/>
               </w:rPr>
-              <w:t>-18</w:t>
-            </w:r>
-          </w:p>
-        </w:tc>
-        <w:tc>
-          <w:tcPr>
-            <w:tcW w:w="0" w:type="auto"/>
-          </w:tcPr>
-          <w:p>
-            <w:pPr>
-              <w:pStyle w:val="Compact"/>
-              <w:jc w:val="right"/>
-            </w:pPr>
-            <w:r>
-              <w:t>-0.00020</w:t>
-            </w:r>
-            <w:r>
-              <w:t>3</w:t>
-            </w:r>
-          </w:p>
-        </w:tc>
-        <w:tc>
-          <w:tcPr>
-            <w:tcW w:w="0" w:type="auto"/>
-          </w:tcPr>
-          <w:p>
-            <w:pPr>
-              <w:pStyle w:val="Compact"/>
-              <w:jc w:val="right"/>
-            </w:pPr>
-            <w:r>
-              <w:t>-0.00020</w:t>
-            </w:r>
-            <w:r>
-              <w:t>3</w:t>
+              <w:t>-19</w:t>
+            </w:r>
+          </w:p>
+        </w:tc>
+        <w:tc>
+          <w:tcPr>
+            <w:tcW w:w="0" w:type="auto"/>
+          </w:tcPr>
+          <w:p>
+            <w:pPr>
+              <w:pStyle w:val="Compact"/>
+              <w:jc w:val="right"/>
+            </w:pPr>
+            <w:r>
+              <w:t>-0.000</w:t>
+            </w:r>
+            <w:r>
+              <w:t>290</w:t>
+            </w:r>
+          </w:p>
+        </w:tc>
+        <w:tc>
+          <w:tcPr>
+            <w:tcW w:w="0" w:type="auto"/>
+          </w:tcPr>
+          <w:p>
+            <w:pPr>
+              <w:pStyle w:val="Compact"/>
+              <w:jc w:val="right"/>
+            </w:pPr>
+            <w:r>
+              <w:t>-0.000</w:t>
+            </w:r>
+            <w:r>
+              <w:t>2</w:t>
+            </w:r>
+            <w:r>
+              <w:t>90</w:t>
             </w:r>
           </w:p>
         </w:tc>
@@ -265,7 +277,7 @@
             </w:pPr>
             <w:proofErr w:type="spellStart"/>
             <w:r>
-              <w:t>Drežnica</w:t>
+              <w:t>Henarejos</w:t>
             </w:r>
             <w:proofErr w:type="spellEnd"/>
           </w:p>
@@ -280,55 +292,76 @@
               <w:jc w:val="right"/>
             </w:pPr>
             <w:r>
-              <w:t>-0.000289</w:t>
-            </w:r>
-          </w:p>
-        </w:tc>
-        <w:tc>
-          <w:tcPr>
-            <w:tcW w:w="0" w:type="auto"/>
-          </w:tcPr>
-          <w:p>
-            <w:pPr>
-              <w:pStyle w:val="Compact"/>
-              <w:jc w:val="right"/>
-            </w:pPr>
-            <w:r>
-              <w:t>0.0000598</w:t>
-            </w:r>
-          </w:p>
-        </w:tc>
-        <w:tc>
-          <w:tcPr>
-            <w:tcW w:w="0" w:type="auto"/>
-          </w:tcPr>
-          <w:p>
-            <w:pPr>
-              <w:pStyle w:val="Compact"/>
-              <w:jc w:val="right"/>
-            </w:pPr>
-            <w:r>
-              <w:t>-0.00039</w:t>
-            </w:r>
-            <w:r>
-              <w:t>4</w:t>
-            </w:r>
-          </w:p>
-        </w:tc>
-        <w:tc>
-          <w:tcPr>
-            <w:tcW w:w="0" w:type="auto"/>
-          </w:tcPr>
-          <w:p>
-            <w:pPr>
-              <w:pStyle w:val="Compact"/>
-              <w:jc w:val="right"/>
-            </w:pPr>
-            <w:r>
-              <w:t>-0.00018</w:t>
-            </w:r>
-            <w:r>
-              <w:t>3</w:t>
+              <w:t>0.0000</w:t>
+            </w:r>
+            <w:r>
+              <w:t>522</w:t>
+            </w:r>
+          </w:p>
+        </w:tc>
+        <w:tc>
+          <w:tcPr>
+            <w:tcW w:w="0" w:type="auto"/>
+          </w:tcPr>
+          <w:p>
+            <w:pPr>
+              <w:pStyle w:val="Compact"/>
+              <w:jc w:val="right"/>
+            </w:pPr>
+            <w:r>
+              <w:t>7.41</w:t>
+            </w:r>
+            <w:r>
+              <w:t xml:space="preserve"> </w:t>
+            </w:r>
+            <w:r>
+              <w:t>x10</w:t>
+            </w:r>
+            <w:r>
+              <w:rPr>
+                <w:vertAlign w:val="superscript"/>
+              </w:rPr>
+              <w:t>-</w:t>
+            </w:r>
+            <w:r>
+              <w:rPr>
+                <w:vertAlign w:val="superscript"/>
+              </w:rPr>
+              <w:t>5</w:t>
+            </w:r>
+          </w:p>
+        </w:tc>
+        <w:tc>
+          <w:tcPr>
+            <w:tcW w:w="0" w:type="auto"/>
+          </w:tcPr>
+          <w:p>
+            <w:pPr>
+              <w:pStyle w:val="Compact"/>
+              <w:jc w:val="right"/>
+            </w:pPr>
+            <w:r>
+              <w:t>-0.000</w:t>
+            </w:r>
+            <w:r>
+              <w:t>0725</w:t>
+            </w:r>
+          </w:p>
+        </w:tc>
+        <w:tc>
+          <w:tcPr>
+            <w:tcW w:w="0" w:type="auto"/>
+          </w:tcPr>
+          <w:p>
+            <w:pPr>
+              <w:pStyle w:val="Compact"/>
+              <w:jc w:val="right"/>
+            </w:pPr>
+            <w:r>
+              <w:t>0.000</w:t>
+            </w:r>
+            <w:r>
+              <w:t>203</w:t>
             </w:r>
           </w:p>
         </w:tc>
@@ -342,66 +375,85 @@
             <w:pPr>
               <w:pStyle w:val="Compact"/>
             </w:pPr>
-            <w:proofErr w:type="spellStart"/>
-            <w:r>
-              <w:t>Henarejos</w:t>
-            </w:r>
-            <w:proofErr w:type="spellEnd"/>
-          </w:p>
-        </w:tc>
-        <w:tc>
-          <w:tcPr>
-            <w:tcW w:w="0" w:type="auto"/>
-          </w:tcPr>
-          <w:p>
-            <w:pPr>
-              <w:pStyle w:val="Compact"/>
-              <w:jc w:val="right"/>
-            </w:pPr>
-            <w:r>
-              <w:t>0.0000796</w:t>
-            </w:r>
-          </w:p>
-        </w:tc>
-        <w:tc>
-          <w:tcPr>
-            <w:tcW w:w="0" w:type="auto"/>
-          </w:tcPr>
-          <w:p>
-            <w:pPr>
-              <w:pStyle w:val="Compact"/>
-              <w:jc w:val="right"/>
-            </w:pPr>
-            <w:r>
-              <w:t>0.0001290</w:t>
-            </w:r>
-          </w:p>
-        </w:tc>
-        <w:tc>
-          <w:tcPr>
-            <w:tcW w:w="0" w:type="auto"/>
-          </w:tcPr>
-          <w:p>
-            <w:pPr>
-              <w:pStyle w:val="Compact"/>
-              <w:jc w:val="right"/>
-            </w:pPr>
-            <w:r>
-              <w:t>-0.0000858</w:t>
-            </w:r>
-          </w:p>
-        </w:tc>
-        <w:tc>
-          <w:tcPr>
-            <w:tcW w:w="0" w:type="auto"/>
-          </w:tcPr>
-          <w:p>
-            <w:pPr>
-              <w:pStyle w:val="Compact"/>
-              <w:jc w:val="right"/>
-            </w:pPr>
-            <w:r>
-              <w:t>0.0003734</w:t>
+            <w:r>
+              <w:t>Libros</w:t>
+            </w:r>
+          </w:p>
+        </w:tc>
+        <w:tc>
+          <w:tcPr>
+            <w:tcW w:w="0" w:type="auto"/>
+          </w:tcPr>
+          <w:p>
+            <w:pPr>
+              <w:pStyle w:val="Compact"/>
+              <w:jc w:val="right"/>
+            </w:pPr>
+            <w:r>
+              <w:t>0.0000</w:t>
+            </w:r>
+            <w:r>
+              <w:t>29</w:t>
+            </w:r>
+            <w:r>
+              <w:t>2</w:t>
+            </w:r>
+          </w:p>
+        </w:tc>
+        <w:tc>
+          <w:tcPr>
+            <w:tcW w:w="0" w:type="auto"/>
+          </w:tcPr>
+          <w:p>
+            <w:pPr>
+              <w:pStyle w:val="Compact"/>
+              <w:jc w:val="right"/>
+            </w:pPr>
+            <w:r>
+              <w:t>0.0001</w:t>
+            </w:r>
+            <w:r>
+              <w:t>8</w:t>
+            </w:r>
+            <w:r>
+              <w:t>8</w:t>
+            </w:r>
+          </w:p>
+        </w:tc>
+        <w:tc>
+          <w:tcPr>
+            <w:tcW w:w="0" w:type="auto"/>
+          </w:tcPr>
+          <w:p>
+            <w:pPr>
+              <w:pStyle w:val="Compact"/>
+              <w:jc w:val="right"/>
+            </w:pPr>
+            <w:r>
+              <w:t>-0.000</w:t>
+            </w:r>
+            <w:r>
+              <w:t>34</w:t>
+            </w:r>
+            <w:r>
+              <w:t>1</w:t>
+            </w:r>
+          </w:p>
+        </w:tc>
+        <w:tc>
+          <w:tcPr>
+            <w:tcW w:w="0" w:type="auto"/>
+          </w:tcPr>
+          <w:p>
+            <w:pPr>
+              <w:pStyle w:val="Compact"/>
+              <w:jc w:val="right"/>
+            </w:pPr>
+            <w:r>
+              <w:t>0.000</w:t>
+            </w:r>
+            <w:r>
+              <w:t>375</w:t>
             </w:r>
           </w:p>
         </w:tc>
@@ -416,41 +468,47 @@
               <w:pStyle w:val="Compact"/>
             </w:pPr>
             <w:r>
-              <w:t>Libros</w:t>
-            </w:r>
-          </w:p>
-        </w:tc>
-        <w:tc>
-          <w:tcPr>
-            <w:tcW w:w="0" w:type="auto"/>
-          </w:tcPr>
-          <w:p>
-            <w:pPr>
-              <w:pStyle w:val="Compact"/>
-              <w:jc w:val="right"/>
-            </w:pPr>
-            <w:r>
-              <w:t>0.0000</w:t>
-            </w:r>
-            <w:r>
-              <w:t>541</w:t>
-            </w:r>
-          </w:p>
-        </w:tc>
-        <w:tc>
-          <w:tcPr>
-            <w:tcW w:w="0" w:type="auto"/>
-          </w:tcPr>
-          <w:p>
-            <w:pPr>
-              <w:pStyle w:val="Compact"/>
-              <w:jc w:val="right"/>
-            </w:pPr>
-            <w:r>
-              <w:t>0.0001</w:t>
-            </w:r>
-            <w:r>
-              <w:t>91</w:t>
+              <w:t>Prikrnica</w:t>
+            </w:r>
+          </w:p>
+        </w:tc>
+        <w:tc>
+          <w:tcPr>
+            <w:tcW w:w="0" w:type="auto"/>
+          </w:tcPr>
+          <w:p>
+            <w:pPr>
+              <w:pStyle w:val="Compact"/>
+              <w:jc w:val="right"/>
+            </w:pPr>
+            <w:r>
+              <w:t>-0.0002</w:t>
+            </w:r>
+            <w:r>
+              <w:t>40</w:t>
+            </w:r>
+          </w:p>
+        </w:tc>
+        <w:tc>
+          <w:tcPr>
+            <w:tcW w:w="0" w:type="auto"/>
+          </w:tcPr>
+          <w:p>
+            <w:pPr>
+              <w:pStyle w:val="Compact"/>
+              <w:jc w:val="right"/>
+            </w:pPr>
+            <w:r>
+              <w:t>0.000</w:t>
+            </w:r>
+            <w:r>
+              <w:t>2</w:t>
+            </w:r>
+            <w:r>
+              <w:t>8</w:t>
+            </w:r>
+            <w:r>
+              <w:t>1</w:t>
             </w:r>
           </w:p>
         </w:tc>
@@ -467,7 +525,7 @@
               <w:t>-0.000</w:t>
             </w:r>
             <w:r>
-              <w:t>212</w:t>
+              <w:t>699</w:t>
             </w:r>
           </w:p>
         </w:tc>
@@ -484,83 +542,10 @@
               <w:t>0.000</w:t>
             </w:r>
             <w:r>
-              <w:t>502</w:t>
-            </w:r>
-          </w:p>
-        </w:tc>
-      </w:tr>
-      <w:tr>
-        <w:tc>
-          <w:tcPr>
-            <w:tcW w:w="0" w:type="auto"/>
-          </w:tcPr>
-          <w:p>
-            <w:pPr>
-              <w:pStyle w:val="Compact"/>
-            </w:pPr>
-            <w:proofErr w:type="spellStart"/>
-            <w:r>
-              <w:t>Prikrnica</w:t>
-            </w:r>
-            <w:proofErr w:type="spellEnd"/>
-          </w:p>
-        </w:tc>
-        <w:tc>
-          <w:tcPr>
-            <w:tcW w:w="0" w:type="auto"/>
-          </w:tcPr>
-          <w:p>
-            <w:pPr>
-              <w:pStyle w:val="Compact"/>
-              <w:jc w:val="right"/>
-            </w:pPr>
-            <w:r>
-              <w:t>-0.000240</w:t>
-            </w:r>
-          </w:p>
-        </w:tc>
-        <w:tc>
-          <w:tcPr>
-            <w:tcW w:w="0" w:type="auto"/>
-          </w:tcPr>
-          <w:p>
-            <w:pPr>
-              <w:pStyle w:val="Compact"/>
-              <w:jc w:val="right"/>
-            </w:pPr>
-            <w:r>
-              <w:t>0.00032</w:t>
-            </w:r>
-            <w:r>
-              <w:t>2</w:t>
-            </w:r>
-          </w:p>
-        </w:tc>
-        <w:tc>
-          <w:tcPr>
-            <w:tcW w:w="0" w:type="auto"/>
-          </w:tcPr>
-          <w:p>
-            <w:pPr>
-              <w:pStyle w:val="Compact"/>
-              <w:jc w:val="right"/>
-            </w:pPr>
-            <w:r>
-              <w:t>-0.000896</w:t>
-            </w:r>
-          </w:p>
-        </w:tc>
-        <w:tc>
-          <w:tcPr>
-            <w:tcW w:w="0" w:type="auto"/>
-          </w:tcPr>
-          <w:p>
-            <w:pPr>
-              <w:pStyle w:val="Compact"/>
-              <w:jc w:val="right"/>
-            </w:pPr>
-            <w:r>
-              <w:t>0.000317</w:t>
+              <w:t>21</w:t>
+            </w:r>
+            <w:r>
+              <w:t>6</w:t>
             </w:r>
           </w:p>
         </w:tc>
@@ -578,7 +563,7 @@
               <w:pStyle w:val="Compact"/>
             </w:pPr>
             <w:r>
-              <w:t>Part</w:t>
+              <w:t>Region</w:t>
             </w:r>
           </w:p>
         </w:tc>
@@ -685,7 +670,15 @@
                 <w:color w:val="000000"/>
                 <w:lang w:eastAsia="en-GB"/>
               </w:rPr>
-              <w:t>0.000203</w:t>
+              <w:t>0.0002</w:t>
+            </w:r>
+            <w:r>
+              <w:rPr>
+                <w:rFonts w:eastAsia="Times New Roman" w:cs="Times New Roman"/>
+                <w:color w:val="000000"/>
+                <w:lang w:eastAsia="en-GB"/>
+              </w:rPr>
+              <w:t>38</w:t>
             </w:r>
           </w:p>
         </w:tc>
@@ -726,7 +719,15 @@
                 <w:color w:val="000000"/>
                 <w:lang w:eastAsia="en-GB"/>
               </w:rPr>
-              <w:t>000269</w:t>
+              <w:t>0002</w:t>
+            </w:r>
+            <w:r>
+              <w:rPr>
+                <w:rFonts w:eastAsia="Times New Roman" w:cs="Times New Roman"/>
+                <w:color w:val="000000"/>
+                <w:lang w:eastAsia="en-GB"/>
+              </w:rPr>
+              <w:t>43</w:t>
             </w:r>
           </w:p>
         </w:tc>
@@ -767,7 +768,15 @@
                 <w:color w:val="000000"/>
                 <w:lang w:eastAsia="en-GB"/>
               </w:rPr>
-              <w:t>0006455</w:t>
+              <w:t>000</w:t>
+            </w:r>
+            <w:r>
+              <w:rPr>
+                <w:rFonts w:eastAsia="Times New Roman" w:cs="Times New Roman"/>
+                <w:color w:val="000000"/>
+                <w:lang w:eastAsia="en-GB"/>
+              </w:rPr>
+              <w:t>764</w:t>
             </w:r>
           </w:p>
         </w:tc>
@@ -808,7 +817,15 @@
                 <w:color w:val="000000"/>
                 <w:lang w:eastAsia="en-GB"/>
               </w:rPr>
-              <w:t>000279</w:t>
+              <w:t>000</w:t>
+            </w:r>
+            <w:r>
+              <w:rPr>
+                <w:rFonts w:eastAsia="Times New Roman" w:cs="Times New Roman"/>
+                <w:color w:val="000000"/>
+                <w:lang w:eastAsia="en-GB"/>
+              </w:rPr>
+              <w:t>234</w:t>
             </w:r>
           </w:p>
         </w:tc>
@@ -848,15 +865,7 @@
                 <w:color w:val="000000"/>
                 <w:lang w:eastAsia="en-GB"/>
               </w:rPr>
-              <w:t>0.0000</w:t>
-            </w:r>
-            <w:r>
-              <w:rPr>
-                <w:rFonts w:eastAsia="Times New Roman" w:cs="Times New Roman"/>
-                <w:color w:val="000000"/>
-                <w:lang w:eastAsia="en-GB"/>
-              </w:rPr>
-              <w:t>300</w:t>
+              <w:t>0.00000828</w:t>
             </w:r>
           </w:p>
         </w:tc>
@@ -905,7 +914,15 @@
                 <w:color w:val="000000"/>
                 <w:lang w:eastAsia="en-GB"/>
               </w:rPr>
-              <w:t>227</w:t>
+              <w:t>2</w:t>
+            </w:r>
+            <w:r>
+              <w:rPr>
+                <w:rFonts w:eastAsia="Times New Roman" w:cs="Times New Roman"/>
+                <w:color w:val="000000"/>
+                <w:lang w:eastAsia="en-GB"/>
+              </w:rPr>
+              <w:t>18</w:t>
             </w:r>
           </w:p>
         </w:tc>
@@ -954,7 +971,15 @@
                 <w:color w:val="000000"/>
                 <w:lang w:eastAsia="en-GB"/>
               </w:rPr>
-              <w:t>0457</w:t>
+              <w:t>0</w:t>
+            </w:r>
+            <w:r>
+              <w:rPr>
+                <w:rFonts w:eastAsia="Times New Roman" w:cs="Times New Roman"/>
+                <w:color w:val="000000"/>
+                <w:lang w:eastAsia="en-GB"/>
+              </w:rPr>
+              <w:t>430</w:t>
             </w:r>
           </w:p>
         </w:tc>
@@ -1003,7 +1028,7 @@
                 <w:color w:val="000000"/>
                 <w:lang w:eastAsia="en-GB"/>
               </w:rPr>
-              <w:t>492</w:t>
+              <w:t>425</w:t>
             </w:r>
           </w:p>
         </w:tc>
@@ -1142,7 +1167,7 @@
                 <w:color w:val="000000"/>
                 <w:lang w:val="en-GB" w:eastAsia="en-GB"/>
               </w:rPr>
-              <w:t>-0.00025</w:t>
+              <w:t>-0.000238</w:t>
             </w:r>
           </w:p>
         </w:tc>
@@ -1171,7 +1196,7 @@
                 <w:color w:val="000000"/>
                 <w:lang w:val="en-GB" w:eastAsia="en-GB"/>
               </w:rPr>
-              <w:t>0.000292</w:t>
+              <w:t>0.000243</w:t>
             </w:r>
           </w:p>
         </w:tc>
@@ -1200,7 +1225,7 @@
                 <w:color w:val="000000"/>
                 <w:lang w:val="en-GB" w:eastAsia="en-GB"/>
               </w:rPr>
-              <w:t>-0.0007981</w:t>
+              <w:t>-0.000764</w:t>
             </w:r>
           </w:p>
         </w:tc>
@@ -1229,7 +1254,7 @@
                 <w:color w:val="000000"/>
                 <w:lang w:val="en-GB" w:eastAsia="en-GB"/>
               </w:rPr>
-              <w:t>0.000409</w:t>
+              <w:t>0.000234</w:t>
             </w:r>
           </w:p>
         </w:tc>
@@ -1262,7 +1287,7 @@
                 <w:color w:val="000000"/>
                 <w:lang w:val="en-GB" w:eastAsia="en-GB"/>
               </w:rPr>
-              <w:t>FZ7</w:t>
+              <w:t>FZ8</w:t>
             </w:r>
           </w:p>
         </w:tc>
@@ -1288,15 +1313,7 @@
                 <w:color w:val="000000"/>
                 <w:lang w:val="en-GB" w:eastAsia="en-GB"/>
               </w:rPr>
-              <w:t>-0.0002</w:t>
-            </w:r>
-            <w:r>
-              <w:rPr>
-                <w:rFonts w:eastAsia="Times New Roman" w:cs="Times New Roman"/>
-                <w:color w:val="000000"/>
-                <w:lang w:val="en-GB" w:eastAsia="en-GB"/>
-              </w:rPr>
-              <w:t>03</w:t>
+              <w:t>0.00000828</w:t>
             </w:r>
           </w:p>
         </w:tc>
@@ -1322,28 +1339,7 @@
                 <w:color w:val="000000"/>
                 <w:lang w:val="en-GB" w:eastAsia="en-GB"/>
               </w:rPr>
-              <w:t>4.11</w:t>
-            </w:r>
-            <w:r>
-              <w:t xml:space="preserve"> </w:t>
-            </w:r>
-            <w:r>
-              <w:t>x10</w:t>
-            </w:r>
-            <w:r>
-              <w:rPr>
-                <w:vertAlign w:val="superscript"/>
-              </w:rPr>
-              <w:t>-</w:t>
-            </w:r>
-            <w:r>
-              <w:rPr>
-                <w:rFonts w:eastAsia="Times New Roman" w:cs="Times New Roman"/>
-                <w:color w:val="000000"/>
-                <w:vertAlign w:val="superscript"/>
-                <w:lang w:val="en-GB" w:eastAsia="en-GB"/>
-              </w:rPr>
-              <w:t>19</w:t>
+              <w:t>0.000218</w:t>
             </w:r>
           </w:p>
         </w:tc>
@@ -1369,15 +1365,7 @@
                 <w:color w:val="000000"/>
                 <w:lang w:val="en-GB" w:eastAsia="en-GB"/>
               </w:rPr>
-              <w:t>-0.00020</w:t>
-            </w:r>
-            <w:r>
-              <w:rPr>
-                <w:rFonts w:eastAsia="Times New Roman" w:cs="Times New Roman"/>
-                <w:color w:val="000000"/>
-                <w:lang w:val="en-GB" w:eastAsia="en-GB"/>
-              </w:rPr>
-              <w:t>3</w:t>
+              <w:t>-0.000430</w:t>
             </w:r>
           </w:p>
         </w:tc>
@@ -1403,168 +1391,7 @@
                 <w:color w:val="000000"/>
                 <w:lang w:val="en-GB" w:eastAsia="en-GB"/>
               </w:rPr>
-              <w:t>-0.0002</w:t>
-            </w:r>
-            <w:r>
-              <w:rPr>
-                <w:rFonts w:eastAsia="Times New Roman" w:cs="Times New Roman"/>
-                <w:color w:val="000000"/>
-                <w:lang w:val="en-GB" w:eastAsia="en-GB"/>
-              </w:rPr>
-              <w:t>03</w:t>
-            </w:r>
-          </w:p>
-        </w:tc>
-      </w:tr>
-      <w:tr>
-        <w:tblPrEx>
-          <w:tblLook w:val="04A0" w:firstRow="1" w:lastRow="0" w:firstColumn="1" w:lastColumn="0" w:noHBand="0" w:noVBand="1"/>
-        </w:tblPrEx>
-        <w:trPr>
-          <w:trHeight w:val="300"/>
-        </w:trPr>
-        <w:tc>
-          <w:tcPr>
-            <w:tcW w:w="1367" w:type="dxa"/>
-            <w:noWrap/>
-            <w:hideMark/>
-          </w:tcPr>
-          <w:p>
-            <w:pPr>
-              <w:spacing w:after="0"/>
-              <w:rPr>
-                <w:rFonts w:eastAsia="Times New Roman" w:cs="Times New Roman"/>
-                <w:color w:val="000000"/>
-                <w:lang w:val="en-GB" w:eastAsia="en-GB"/>
-              </w:rPr>
-            </w:pPr>
-            <w:r>
-              <w:rPr>
-                <w:rFonts w:eastAsia="Times New Roman" w:cs="Times New Roman"/>
-                <w:color w:val="000000"/>
-                <w:lang w:val="en-GB" w:eastAsia="en-GB"/>
-              </w:rPr>
-              <w:t>FZ8</w:t>
-            </w:r>
-          </w:p>
-        </w:tc>
-        <w:tc>
-          <w:tcPr>
-            <w:tcW w:w="1414" w:type="dxa"/>
-            <w:noWrap/>
-            <w:hideMark/>
-          </w:tcPr>
-          <w:p>
-            <w:pPr>
-              <w:spacing w:after="0"/>
-              <w:jc w:val="right"/>
-              <w:rPr>
-                <w:rFonts w:eastAsia="Times New Roman" w:cs="Times New Roman"/>
-                <w:color w:val="000000"/>
-                <w:lang w:val="en-GB" w:eastAsia="en-GB"/>
-              </w:rPr>
-            </w:pPr>
-            <w:r>
-              <w:rPr>
-                <w:rFonts w:eastAsia="Times New Roman" w:cs="Times New Roman"/>
-                <w:color w:val="000000"/>
-                <w:lang w:val="en-GB" w:eastAsia="en-GB"/>
-              </w:rPr>
-              <w:t>0.0000</w:t>
-            </w:r>
-            <w:r>
-              <w:rPr>
-                <w:rFonts w:eastAsia="Times New Roman" w:cs="Times New Roman"/>
-                <w:color w:val="000000"/>
-                <w:lang w:val="en-GB" w:eastAsia="en-GB"/>
-              </w:rPr>
-              <w:t>223</w:t>
-            </w:r>
-          </w:p>
-        </w:tc>
-        <w:tc>
-          <w:tcPr>
-            <w:tcW w:w="1311" w:type="dxa"/>
-            <w:noWrap/>
-            <w:hideMark/>
-          </w:tcPr>
-          <w:p>
-            <w:pPr>
-              <w:spacing w:after="0"/>
-              <w:jc w:val="right"/>
-              <w:rPr>
-                <w:rFonts w:eastAsia="Times New Roman" w:cs="Times New Roman"/>
-                <w:color w:val="000000"/>
-                <w:lang w:val="en-GB" w:eastAsia="en-GB"/>
-              </w:rPr>
-            </w:pPr>
-            <w:r>
-              <w:rPr>
-                <w:rFonts w:eastAsia="Times New Roman" w:cs="Times New Roman"/>
-                <w:color w:val="000000"/>
-                <w:lang w:val="en-GB" w:eastAsia="en-GB"/>
-              </w:rPr>
-              <w:t>0.0002</w:t>
-            </w:r>
-            <w:r>
-              <w:rPr>
-                <w:rFonts w:eastAsia="Times New Roman" w:cs="Times New Roman"/>
-                <w:color w:val="000000"/>
-                <w:lang w:val="en-GB" w:eastAsia="en-GB"/>
-              </w:rPr>
-              <w:t>63</w:t>
-            </w:r>
-          </w:p>
-        </w:tc>
-        <w:tc>
-          <w:tcPr>
-            <w:tcW w:w="1431" w:type="dxa"/>
-            <w:noWrap/>
-            <w:hideMark/>
-          </w:tcPr>
-          <w:p>
-            <w:pPr>
-              <w:spacing w:after="0"/>
-              <w:jc w:val="right"/>
-              <w:rPr>
-                <w:rFonts w:eastAsia="Times New Roman" w:cs="Times New Roman"/>
-                <w:color w:val="000000"/>
-                <w:lang w:val="en-GB" w:eastAsia="en-GB"/>
-              </w:rPr>
-            </w:pPr>
-            <w:r>
-              <w:rPr>
-                <w:rFonts w:eastAsia="Times New Roman" w:cs="Times New Roman"/>
-                <w:color w:val="000000"/>
-                <w:lang w:val="en-GB" w:eastAsia="en-GB"/>
-              </w:rPr>
-              <w:t>-0.000411</w:t>
-            </w:r>
-          </w:p>
-        </w:tc>
-        <w:tc>
-          <w:tcPr>
-            <w:tcW w:w="1439" w:type="dxa"/>
-            <w:noWrap/>
-            <w:hideMark/>
-          </w:tcPr>
-          <w:p>
-            <w:pPr>
-              <w:spacing w:after="0"/>
-              <w:jc w:val="right"/>
-              <w:rPr>
-                <w:rFonts w:eastAsia="Times New Roman" w:cs="Times New Roman"/>
-                <w:color w:val="000000"/>
-                <w:lang w:val="en-GB" w:eastAsia="en-GB"/>
-              </w:rPr>
-            </w:pPr>
-            <w:r>
-              <w:rPr>
-                <w:rFonts w:eastAsia="Times New Roman" w:cs="Times New Roman"/>
-                <w:color w:val="000000"/>
-                <w:lang w:val="en-GB" w:eastAsia="en-GB"/>
-              </w:rPr>
-              <w:t>0.000592</w:t>
+              <w:t>0.000425</w:t>
             </w:r>
           </w:p>
         </w:tc>
@@ -1929,15 +1756,15 @@
     <w:lsdException w:name="Unresolved Mention" w:semiHidden="1" w:uiPriority="99" w:unhideWhenUsed="1"/>
     <w:lsdException w:name="Smart Link" w:semiHidden="1" w:uiPriority="99" w:unhideWhenUsed="1"/>
   </w:latentStyles>
-  <w:style w:type="paragraph" w:default="1" w:styleId="Navaden">
+  <w:style w:type="paragraph" w:default="1" w:styleId="Normal">
     <w:name w:val="Normal"/>
     <w:qFormat/>
   </w:style>
-  <w:style w:type="paragraph" w:styleId="Naslov1">
+  <w:style w:type="paragraph" w:styleId="Heading1">
     <w:name w:val="heading 1"/>
-    <w:basedOn w:val="Navaden"/>
-    <w:next w:val="Telobesedila"/>
-    <w:link w:val="Naslov1Znak"/>
+    <w:basedOn w:val="Normal"/>
+    <w:next w:val="BodyText"/>
+    <w:link w:val="Heading1Char"/>
     <w:uiPriority w:val="9"/>
     <w:qFormat/>
     <w:rsid w:val="00A10FD9"/>
@@ -1954,11 +1781,11 @@
       <w:szCs w:val="40"/>
     </w:rPr>
   </w:style>
-  <w:style w:type="paragraph" w:styleId="Naslov2">
+  <w:style w:type="paragraph" w:styleId="Heading2">
     <w:name w:val="heading 2"/>
-    <w:basedOn w:val="Navaden"/>
-    <w:next w:val="Telobesedila"/>
-    <w:link w:val="Naslov2Znak"/>
+    <w:basedOn w:val="Normal"/>
+    <w:next w:val="BodyText"/>
+    <w:link w:val="Heading2Char"/>
     <w:uiPriority w:val="9"/>
     <w:semiHidden/>
     <w:unhideWhenUsed/>
@@ -1977,11 +1804,11 @@
       <w:szCs w:val="32"/>
     </w:rPr>
   </w:style>
-  <w:style w:type="paragraph" w:styleId="Naslov3">
+  <w:style w:type="paragraph" w:styleId="Heading3">
     <w:name w:val="heading 3"/>
-    <w:basedOn w:val="Navaden"/>
-    <w:next w:val="Telobesedila"/>
-    <w:link w:val="Naslov3Znak"/>
+    <w:basedOn w:val="Normal"/>
+    <w:next w:val="BodyText"/>
+    <w:link w:val="Heading3Char"/>
     <w:uiPriority w:val="9"/>
     <w:semiHidden/>
     <w:unhideWhenUsed/>
@@ -2000,11 +1827,11 @@
       <w:szCs w:val="28"/>
     </w:rPr>
   </w:style>
-  <w:style w:type="paragraph" w:styleId="Naslov4">
+  <w:style w:type="paragraph" w:styleId="Heading4">
     <w:name w:val="heading 4"/>
-    <w:basedOn w:val="Navaden"/>
-    <w:next w:val="Telobesedila"/>
-    <w:link w:val="Naslov4Znak"/>
+    <w:basedOn w:val="Normal"/>
+    <w:next w:val="BodyText"/>
+    <w:link w:val="Heading4Char"/>
     <w:uiPriority w:val="9"/>
     <w:semiHidden/>
     <w:unhideWhenUsed/>
@@ -2023,11 +1850,11 @@
       <w:color w:val="0F4761" w:themeColor="accent1" w:themeShade="BF"/>
     </w:rPr>
   </w:style>
-  <w:style w:type="paragraph" w:styleId="Naslov5">
+  <w:style w:type="paragraph" w:styleId="Heading5">
     <w:name w:val="heading 5"/>
-    <w:basedOn w:val="Navaden"/>
-    <w:next w:val="Telobesedila"/>
-    <w:link w:val="Naslov5Znak"/>
+    <w:basedOn w:val="Normal"/>
+    <w:next w:val="BodyText"/>
+    <w:link w:val="Heading5Char"/>
     <w:uiPriority w:val="9"/>
     <w:semiHidden/>
     <w:unhideWhenUsed/>
@@ -2044,11 +1871,11 @@
       <w:color w:val="0F4761" w:themeColor="accent1" w:themeShade="BF"/>
     </w:rPr>
   </w:style>
-  <w:style w:type="paragraph" w:styleId="Naslov6">
+  <w:style w:type="paragraph" w:styleId="Heading6">
     <w:name w:val="heading 6"/>
-    <w:basedOn w:val="Navaden"/>
-    <w:next w:val="Telobesedila"/>
-    <w:link w:val="Naslov6Znak"/>
+    <w:basedOn w:val="Normal"/>
+    <w:next w:val="BodyText"/>
+    <w:link w:val="Heading6Char"/>
     <w:uiPriority w:val="9"/>
     <w:semiHidden/>
     <w:unhideWhenUsed/>
@@ -2067,11 +1894,11 @@
       <w:color w:val="595959" w:themeColor="text1" w:themeTint="A6"/>
     </w:rPr>
   </w:style>
-  <w:style w:type="paragraph" w:styleId="Naslov7">
+  <w:style w:type="paragraph" w:styleId="Heading7">
     <w:name w:val="heading 7"/>
-    <w:basedOn w:val="Navaden"/>
-    <w:next w:val="Telobesedila"/>
-    <w:link w:val="Naslov7Znak"/>
+    <w:basedOn w:val="Normal"/>
+    <w:next w:val="BodyText"/>
+    <w:link w:val="Heading7Char"/>
     <w:uiPriority w:val="9"/>
     <w:semiHidden/>
     <w:unhideWhenUsed/>
@@ -2088,11 +1915,11 @@
       <w:color w:val="595959" w:themeColor="text1" w:themeTint="A6"/>
     </w:rPr>
   </w:style>
-  <w:style w:type="paragraph" w:styleId="Naslov8">
+  <w:style w:type="paragraph" w:styleId="Heading8">
     <w:name w:val="heading 8"/>
-    <w:basedOn w:val="Navaden"/>
-    <w:next w:val="Telobesedila"/>
-    <w:link w:val="Naslov8Znak"/>
+    <w:basedOn w:val="Normal"/>
+    <w:next w:val="BodyText"/>
+    <w:link w:val="Heading8Char"/>
     <w:uiPriority w:val="9"/>
     <w:semiHidden/>
     <w:unhideWhenUsed/>
@@ -2111,11 +1938,11 @@
       <w:color w:val="272727" w:themeColor="text1" w:themeTint="D8"/>
     </w:rPr>
   </w:style>
-  <w:style w:type="paragraph" w:styleId="Naslov9">
+  <w:style w:type="paragraph" w:styleId="Heading9">
     <w:name w:val="heading 9"/>
-    <w:basedOn w:val="Navaden"/>
-    <w:next w:val="Telobesedila"/>
-    <w:link w:val="Naslov9Znak"/>
+    <w:basedOn w:val="Normal"/>
+    <w:next w:val="BodyText"/>
+    <w:link w:val="Heading9Char"/>
     <w:uiPriority w:val="9"/>
     <w:semiHidden/>
     <w:unhideWhenUsed/>
@@ -2132,12 +1959,12 @@
       <w:color w:val="272727" w:themeColor="text1" w:themeTint="D8"/>
     </w:rPr>
   </w:style>
-  <w:style w:type="character" w:default="1" w:styleId="Privzetapisavaodstavka">
+  <w:style w:type="character" w:default="1" w:styleId="DefaultParagraphFont">
     <w:name w:val="Default Paragraph Font"/>
     <w:uiPriority w:val="1"/>
     <w:unhideWhenUsed/>
   </w:style>
-  <w:style w:type="table" w:default="1" w:styleId="Navadnatabela">
+  <w:style w:type="table" w:default="1" w:styleId="TableNormal">
     <w:name w:val="Normal Table"/>
     <w:uiPriority w:val="99"/>
     <w:semiHidden/>
@@ -2152,15 +1979,15 @@
       </w:tblCellMar>
     </w:tblPr>
   </w:style>
-  <w:style w:type="numbering" w:default="1" w:styleId="Brezseznama">
+  <w:style w:type="numbering" w:default="1" w:styleId="NoList">
     <w:name w:val="No List"/>
     <w:uiPriority w:val="99"/>
     <w:semiHidden/>
     <w:unhideWhenUsed/>
   </w:style>
-  <w:style w:type="paragraph" w:styleId="Telobesedila">
+  <w:style w:type="paragraph" w:styleId="BodyText">
     <w:name w:val="Body Text"/>
-    <w:basedOn w:val="Navaden"/>
+    <w:basedOn w:val="Normal"/>
     <w:qFormat/>
     <w:pPr>
       <w:spacing w:before="180" w:after="180"/>
@@ -2168,23 +1995,23 @@
   </w:style>
   <w:style w:type="paragraph" w:customStyle="1" w:styleId="FirstParagraph">
     <w:name w:val="First Paragraph"/>
-    <w:basedOn w:val="Telobesedila"/>
-    <w:next w:val="Telobesedila"/>
+    <w:basedOn w:val="BodyText"/>
+    <w:next w:val="BodyText"/>
     <w:qFormat/>
   </w:style>
   <w:style w:type="paragraph" w:customStyle="1" w:styleId="Compact">
     <w:name w:val="Compact"/>
-    <w:basedOn w:val="Telobesedila"/>
+    <w:basedOn w:val="BodyText"/>
     <w:qFormat/>
     <w:pPr>
       <w:spacing w:before="36" w:after="36"/>
     </w:pPr>
   </w:style>
-  <w:style w:type="paragraph" w:styleId="Naslov">
+  <w:style w:type="paragraph" w:styleId="Title">
     <w:name w:val="Title"/>
-    <w:basedOn w:val="Navaden"/>
-    <w:next w:val="Telobesedila"/>
-    <w:link w:val="NaslovZnak"/>
+    <w:basedOn w:val="Normal"/>
+    <w:next w:val="BodyText"/>
+    <w:link w:val="TitleChar"/>
     <w:uiPriority w:val="10"/>
     <w:qFormat/>
     <w:rsid w:val="00A10FD9"/>
@@ -2199,10 +2026,10 @@
       <w:szCs w:val="56"/>
     </w:rPr>
   </w:style>
-  <w:style w:type="character" w:customStyle="1" w:styleId="NaslovZnak">
-    <w:name w:val="Naslov Znak"/>
-    <w:basedOn w:val="Privzetapisavaodstavka"/>
-    <w:link w:val="Naslov"/>
+  <w:style w:type="character" w:customStyle="1" w:styleId="TitleChar">
+    <w:name w:val="Title Char"/>
+    <w:basedOn w:val="DefaultParagraphFont"/>
+    <w:link w:val="Title"/>
     <w:uiPriority w:val="10"/>
     <w:rsid w:val="00A10FD9"/>
     <w:rPr>
@@ -2211,11 +2038,11 @@
       <w:szCs w:val="56"/>
     </w:rPr>
   </w:style>
-  <w:style w:type="paragraph" w:styleId="Podnaslov">
+  <w:style w:type="paragraph" w:styleId="Subtitle">
     <w:name w:val="Subtitle"/>
-    <w:basedOn w:val="Naslov"/>
-    <w:next w:val="Telobesedila"/>
-    <w:link w:val="PodnaslovZnak"/>
+    <w:basedOn w:val="Title"/>
+    <w:next w:val="BodyText"/>
+    <w:link w:val="SubtitleChar"/>
     <w:uiPriority w:val="11"/>
     <w:qFormat/>
     <w:rsid w:val="00A10FD9"/>
@@ -2230,10 +2057,10 @@
       <w:szCs w:val="28"/>
     </w:rPr>
   </w:style>
-  <w:style w:type="character" w:customStyle="1" w:styleId="PodnaslovZnak">
-    <w:name w:val="Podnaslov Znak"/>
-    <w:basedOn w:val="Privzetapisavaodstavka"/>
-    <w:link w:val="Podnaslov"/>
+  <w:style w:type="character" w:customStyle="1" w:styleId="SubtitleChar">
+    <w:name w:val="Subtitle Char"/>
+    <w:basedOn w:val="DefaultParagraphFont"/>
+    <w:link w:val="Subtitle"/>
     <w:uiPriority w:val="11"/>
     <w:rsid w:val="00A10FD9"/>
     <w:rPr>
@@ -2246,8 +2073,8 @@
   </w:style>
   <w:style w:type="paragraph" w:customStyle="1" w:styleId="Author">
     <w:name w:val="Author"/>
-    <w:basedOn w:val="Naslov"/>
-    <w:next w:val="Telobesedila"/>
+    <w:basedOn w:val="Title"/>
+    <w:next w:val="BodyText"/>
     <w:qFormat/>
     <w:pPr>
       <w:keepNext/>
@@ -2258,10 +2085,10 @@
       <w:szCs w:val="24"/>
     </w:rPr>
   </w:style>
-  <w:style w:type="paragraph" w:styleId="Datum">
+  <w:style w:type="paragraph" w:styleId="Date">
     <w:name w:val="Date"/>
-    <w:basedOn w:val="Naslov"/>
-    <w:next w:val="Telobesedila"/>
+    <w:basedOn w:val="Title"/>
+    <w:next w:val="BodyText"/>
     <w:qFormat/>
     <w:pPr>
       <w:keepNext/>
@@ -2274,7 +2101,7 @@
   </w:style>
   <w:style w:type="paragraph" w:customStyle="1" w:styleId="AbstractTitle">
     <w:name w:val="Abstract Title"/>
-    <w:basedOn w:val="Navaden"/>
+    <w:basedOn w:val="Normal"/>
     <w:next w:val="Abstract"/>
     <w:qFormat/>
     <w:pPr>
@@ -2291,8 +2118,8 @@
   </w:style>
   <w:style w:type="paragraph" w:customStyle="1" w:styleId="Abstract">
     <w:name w:val="Abstract"/>
-    <w:basedOn w:val="Navaden"/>
-    <w:next w:val="Telobesedila"/>
+    <w:basedOn w:val="Normal"/>
+    <w:next w:val="BodyText"/>
     <w:qFormat/>
     <w:pPr>
       <w:keepNext/>
@@ -2304,15 +2131,15 @@
       <w:szCs w:val="20"/>
     </w:rPr>
   </w:style>
-  <w:style w:type="paragraph" w:styleId="Bibliografija">
+  <w:style w:type="paragraph" w:styleId="Bibliography">
     <w:name w:val="Bibliography"/>
-    <w:basedOn w:val="Navaden"/>
+    <w:basedOn w:val="Normal"/>
     <w:qFormat/>
   </w:style>
-  <w:style w:type="character" w:customStyle="1" w:styleId="Naslov1Znak">
-    <w:name w:val="Naslov 1 Znak"/>
-    <w:basedOn w:val="Privzetapisavaodstavka"/>
-    <w:link w:val="Naslov1"/>
+  <w:style w:type="character" w:customStyle="1" w:styleId="Heading1Char">
+    <w:name w:val="Heading 1 Char"/>
+    <w:basedOn w:val="DefaultParagraphFont"/>
+    <w:link w:val="Heading1"/>
     <w:uiPriority w:val="9"/>
     <w:rsid w:val="00A10FD9"/>
     <w:rPr>
@@ -2322,10 +2149,10 @@
       <w:szCs w:val="40"/>
     </w:rPr>
   </w:style>
-  <w:style w:type="character" w:customStyle="1" w:styleId="Naslov2Znak">
-    <w:name w:val="Naslov 2 Znak"/>
-    <w:basedOn w:val="Privzetapisavaodstavka"/>
-    <w:link w:val="Naslov2"/>
+  <w:style w:type="character" w:customStyle="1" w:styleId="Heading2Char">
+    <w:name w:val="Heading 2 Char"/>
+    <w:basedOn w:val="DefaultParagraphFont"/>
+    <w:link w:val="Heading2"/>
     <w:uiPriority w:val="9"/>
     <w:semiHidden/>
     <w:rsid w:val="00A10FD9"/>
@@ -2336,10 +2163,10 @@
       <w:szCs w:val="32"/>
     </w:rPr>
   </w:style>
-  <w:style w:type="character" w:customStyle="1" w:styleId="Naslov3Znak">
-    <w:name w:val="Naslov 3 Znak"/>
-    <w:basedOn w:val="Privzetapisavaodstavka"/>
-    <w:link w:val="Naslov3"/>
+  <w:style w:type="character" w:customStyle="1" w:styleId="Heading3Char">
+    <w:name w:val="Heading 3 Char"/>
+    <w:basedOn w:val="DefaultParagraphFont"/>
+    <w:link w:val="Heading3"/>
     <w:uiPriority w:val="9"/>
     <w:semiHidden/>
     <w:rsid w:val="00A10FD9"/>
@@ -2350,10 +2177,10 @@
       <w:szCs w:val="28"/>
     </w:rPr>
   </w:style>
-  <w:style w:type="character" w:customStyle="1" w:styleId="Naslov4Znak">
-    <w:name w:val="Naslov 4 Znak"/>
-    <w:basedOn w:val="Privzetapisavaodstavka"/>
-    <w:link w:val="Naslov4"/>
+  <w:style w:type="character" w:customStyle="1" w:styleId="Heading4Char">
+    <w:name w:val="Heading 4 Char"/>
+    <w:basedOn w:val="DefaultParagraphFont"/>
+    <w:link w:val="Heading4"/>
     <w:uiPriority w:val="9"/>
     <w:semiHidden/>
     <w:rsid w:val="00A10FD9"/>
@@ -2364,10 +2191,10 @@
       <w:color w:val="0F4761" w:themeColor="accent1" w:themeShade="BF"/>
     </w:rPr>
   </w:style>
-  <w:style w:type="character" w:customStyle="1" w:styleId="Naslov5Znak">
-    <w:name w:val="Naslov 5 Znak"/>
-    <w:basedOn w:val="Privzetapisavaodstavka"/>
-    <w:link w:val="Naslov5"/>
+  <w:style w:type="character" w:customStyle="1" w:styleId="Heading5Char">
+    <w:name w:val="Heading 5 Char"/>
+    <w:basedOn w:val="DefaultParagraphFont"/>
+    <w:link w:val="Heading5"/>
     <w:uiPriority w:val="9"/>
     <w:semiHidden/>
     <w:rsid w:val="00A10FD9"/>
@@ -2376,10 +2203,10 @@
       <w:color w:val="0F4761" w:themeColor="accent1" w:themeShade="BF"/>
     </w:rPr>
   </w:style>
-  <w:style w:type="character" w:customStyle="1" w:styleId="Naslov6Znak">
-    <w:name w:val="Naslov 6 Znak"/>
-    <w:basedOn w:val="Privzetapisavaodstavka"/>
-    <w:link w:val="Naslov6"/>
+  <w:style w:type="character" w:customStyle="1" w:styleId="Heading6Char">
+    <w:name w:val="Heading 6 Char"/>
+    <w:basedOn w:val="DefaultParagraphFont"/>
+    <w:link w:val="Heading6"/>
     <w:uiPriority w:val="9"/>
     <w:semiHidden/>
     <w:rsid w:val="00A10FD9"/>
@@ -2390,10 +2217,10 @@
       <w:color w:val="595959" w:themeColor="text1" w:themeTint="A6"/>
     </w:rPr>
   </w:style>
-  <w:style w:type="character" w:customStyle="1" w:styleId="Naslov7Znak">
-    <w:name w:val="Naslov 7 Znak"/>
-    <w:basedOn w:val="Privzetapisavaodstavka"/>
-    <w:link w:val="Naslov7"/>
+  <w:style w:type="character" w:customStyle="1" w:styleId="Heading7Char">
+    <w:name w:val="Heading 7 Char"/>
+    <w:basedOn w:val="DefaultParagraphFont"/>
+    <w:link w:val="Heading7"/>
     <w:uiPriority w:val="9"/>
     <w:semiHidden/>
     <w:rsid w:val="00A10FD9"/>
@@ -2402,10 +2229,10 @@
       <w:color w:val="595959" w:themeColor="text1" w:themeTint="A6"/>
     </w:rPr>
   </w:style>
-  <w:style w:type="character" w:customStyle="1" w:styleId="Naslov8Znak">
-    <w:name w:val="Naslov 8 Znak"/>
-    <w:basedOn w:val="Privzetapisavaodstavka"/>
-    <w:link w:val="Naslov8"/>
+  <w:style w:type="character" w:customStyle="1" w:styleId="Heading8Char">
+    <w:name w:val="Heading 8 Char"/>
+    <w:basedOn w:val="DefaultParagraphFont"/>
+    <w:link w:val="Heading8"/>
     <w:uiPriority w:val="9"/>
     <w:semiHidden/>
     <w:rsid w:val="00A10FD9"/>
@@ -2416,10 +2243,10 @@
       <w:color w:val="272727" w:themeColor="text1" w:themeTint="D8"/>
     </w:rPr>
   </w:style>
-  <w:style w:type="character" w:customStyle="1" w:styleId="Naslov9Znak">
-    <w:name w:val="Naslov 9 Znak"/>
-    <w:basedOn w:val="Privzetapisavaodstavka"/>
-    <w:link w:val="Naslov9"/>
+  <w:style w:type="character" w:customStyle="1" w:styleId="Heading9Char">
+    <w:name w:val="Heading 9 Char"/>
+    <w:basedOn w:val="DefaultParagraphFont"/>
+    <w:link w:val="Heading9"/>
     <w:uiPriority w:val="9"/>
     <w:semiHidden/>
     <w:rsid w:val="00A10FD9"/>
@@ -2428,10 +2255,10 @@
       <w:color w:val="272727" w:themeColor="text1" w:themeTint="D8"/>
     </w:rPr>
   </w:style>
-  <w:style w:type="paragraph" w:styleId="Blokbesedila">
+  <w:style w:type="paragraph" w:styleId="BlockText">
     <w:name w:val="Block Text"/>
-    <w:basedOn w:val="Telobesedila"/>
-    <w:next w:val="Telobesedila"/>
+    <w:basedOn w:val="BodyText"/>
+    <w:next w:val="BodyText"/>
     <w:uiPriority w:val="9"/>
     <w:unhideWhenUsed/>
     <w:qFormat/>
@@ -2440,17 +2267,17 @@
       <w:ind w:left="480" w:right="480"/>
     </w:pPr>
   </w:style>
-  <w:style w:type="paragraph" w:styleId="Sprotnaopomba-besedilo">
+  <w:style w:type="paragraph" w:styleId="FootnoteText">
     <w:name w:val="footnote text"/>
-    <w:basedOn w:val="Navaden"/>
+    <w:basedOn w:val="Normal"/>
     <w:uiPriority w:val="9"/>
     <w:unhideWhenUsed/>
     <w:qFormat/>
   </w:style>
   <w:style w:type="paragraph" w:customStyle="1" w:styleId="FootnoteBlockText">
     <w:name w:val="Footnote Block Text"/>
-    <w:basedOn w:val="Sprotnaopomba-besedilo"/>
-    <w:next w:val="Sprotnaopomba-besedilo"/>
+    <w:basedOn w:val="FootnoteText"/>
+    <w:next w:val="FootnoteText"/>
     <w:uiPriority w:val="9"/>
     <w:unhideWhenUsed/>
     <w:qFormat/>
@@ -2490,7 +2317,7 @@
   </w:style>
   <w:style w:type="paragraph" w:customStyle="1" w:styleId="DefinitionTerm">
     <w:name w:val="Definition Term"/>
-    <w:basedOn w:val="Navaden"/>
+    <w:basedOn w:val="Normal"/>
     <w:next w:val="Definition"/>
     <w:pPr>
       <w:keepNext/>
@@ -2503,12 +2330,12 @@
   </w:style>
   <w:style w:type="paragraph" w:customStyle="1" w:styleId="Definition">
     <w:name w:val="Definition"/>
-    <w:basedOn w:val="Navaden"/>
-  </w:style>
-  <w:style w:type="paragraph" w:styleId="Napis">
+    <w:basedOn w:val="Normal"/>
+  </w:style>
+  <w:style w:type="paragraph" w:styleId="Caption">
     <w:name w:val="caption"/>
-    <w:basedOn w:val="Navaden"/>
-    <w:link w:val="NapisZnak"/>
+    <w:basedOn w:val="Normal"/>
+    <w:link w:val="CaptionChar"/>
     <w:pPr>
       <w:spacing w:after="120"/>
     </w:pPr>
@@ -2518,18 +2345,18 @@
   </w:style>
   <w:style w:type="paragraph" w:customStyle="1" w:styleId="TableCaption">
     <w:name w:val="Table Caption"/>
-    <w:basedOn w:val="Napis"/>
+    <w:basedOn w:val="Caption"/>
     <w:pPr>
       <w:keepNext/>
     </w:pPr>
   </w:style>
   <w:style w:type="paragraph" w:customStyle="1" w:styleId="ImageCaption">
     <w:name w:val="Image Caption"/>
-    <w:basedOn w:val="Napis"/>
+    <w:basedOn w:val="Caption"/>
   </w:style>
   <w:style w:type="paragraph" w:customStyle="1" w:styleId="Figure">
     <w:name w:val="Figure"/>
-    <w:basedOn w:val="Navaden"/>
+    <w:basedOn w:val="Normal"/>
   </w:style>
   <w:style w:type="paragraph" w:customStyle="1" w:styleId="CaptionedFigure">
     <w:name w:val="Captioned Figure"/>
@@ -2538,14 +2365,14 @@
       <w:keepNext/>
     </w:pPr>
   </w:style>
-  <w:style w:type="character" w:customStyle="1" w:styleId="NapisZnak">
-    <w:name w:val="Napis Znak"/>
-    <w:basedOn w:val="Privzetapisavaodstavka"/>
-    <w:link w:val="Napis"/>
+  <w:style w:type="character" w:customStyle="1" w:styleId="CaptionChar">
+    <w:name w:val="Caption Char"/>
+    <w:basedOn w:val="DefaultParagraphFont"/>
+    <w:link w:val="Caption"/>
   </w:style>
   <w:style w:type="character" w:customStyle="1" w:styleId="VerbatimChar">
     <w:name w:val="Verbatim Char"/>
-    <w:basedOn w:val="NapisZnak"/>
+    <w:basedOn w:val="CaptionChar"/>
     <w:link w:val="SourceCode"/>
     <w:rPr>
       <w:rFonts w:ascii="Consolas" w:hAnsi="Consolas"/>
@@ -2554,26 +2381,26 @@
   </w:style>
   <w:style w:type="character" w:customStyle="1" w:styleId="SectionNumber">
     <w:name w:val="Section Number"/>
-    <w:basedOn w:val="NapisZnak"/>
-  </w:style>
-  <w:style w:type="character" w:styleId="Sprotnaopomba-sklic">
+    <w:basedOn w:val="CaptionChar"/>
+  </w:style>
+  <w:style w:type="character" w:styleId="FootnoteReference">
     <w:name w:val="footnote reference"/>
-    <w:basedOn w:val="NapisZnak"/>
+    <w:basedOn w:val="CaptionChar"/>
     <w:rPr>
       <w:vertAlign w:val="superscript"/>
     </w:rPr>
   </w:style>
-  <w:style w:type="character" w:styleId="Hiperpovezava">
+  <w:style w:type="character" w:styleId="Hyperlink">
     <w:name w:val="Hyperlink"/>
-    <w:basedOn w:val="NapisZnak"/>
+    <w:basedOn w:val="CaptionChar"/>
     <w:rPr>
       <w:color w:val="156082" w:themeColor="accent1"/>
     </w:rPr>
   </w:style>
-  <w:style w:type="paragraph" w:styleId="NaslovTOC">
+  <w:style w:type="paragraph" w:styleId="TOCHeading">
     <w:name w:val="TOC Heading"/>
-    <w:basedOn w:val="Naslov1"/>
-    <w:next w:val="Telobesedila"/>
+    <w:basedOn w:val="Heading1"/>
+    <w:next w:val="BodyText"/>
     <w:uiPriority w:val="39"/>
     <w:unhideWhenUsed/>
     <w:qFormat/>
@@ -2584,7 +2411,7 @@
   </w:style>
   <w:style w:type="paragraph" w:customStyle="1" w:styleId="SourceCode">
     <w:name w:val="Source Code"/>
-    <w:basedOn w:val="Navaden"/>
+    <w:basedOn w:val="Normal"/>
     <w:link w:val="VerbatimChar"/>
     <w:pPr>
       <w:shd w:val="clear" w:color="auto" w:fill="F8F8F8"/>
@@ -2913,6 +2740,11 @@
       <w:sz w:val="22"/>
       <w:shd w:val="clear" w:color="auto" w:fill="F8F8F8"/>
     </w:rPr>
+  </w:style>
+  <w:style w:type="character" w:customStyle="1" w:styleId="gpwvoe5cb5b">
+    <w:name w:val="gpwvoe5cb5b"/>
+    <w:basedOn w:val="DefaultParagraphFont"/>
+    <w:rsid w:val="00994B2B"/>
   </w:style>
 </w:styles>
 </file>

</xml_diff>